<commit_message>
update:UI companents, search modal
</commit_message>
<xml_diff>
--- a/docs/mapping.docx
+++ b/docs/mapping.docx
@@ -285,7 +285,6 @@
         <w:t>- Should have installation files so that it is an installed app on these devices.</w:t>
       </w:r>
     </w:p>
-    <w:p/>
     <w:p/>
     <w:p/>
     <w:p>
@@ -390,6 +389,771 @@
         <w:pStyle w:val="ListParagraph"/>
       </w:pPr>
     </w:p>
+    <w:p>
+      <w:pPr>
+        <w:pStyle w:val="ListParagraph"/>
+      </w:pPr>
+    </w:p>
+    <w:p>
+      <w:pPr>
+        <w:rPr>
+          <w:b/>
+          <w:bCs/>
+        </w:rPr>
+      </w:pPr>
+      <w:r>
+        <w:rPr>
+          <w:b/>
+          <w:bCs/>
+        </w:rPr>
+        <w:t>Moses Butchery – Web-Based Order Tracing Application</w:t>
+      </w:r>
+    </w:p>
+    <w:p>
+      <w:pPr>
+        <w:rPr>
+          <w:b/>
+          <w:bCs/>
+        </w:rPr>
+      </w:pPr>
+      <w:r>
+        <w:rPr>
+          <w:b/>
+          <w:bCs/>
+        </w:rPr>
+        <w:t>Overview</w:t>
+      </w:r>
+    </w:p>
+    <w:p>
+      <w:r>
+        <w:t xml:space="preserve">Moses Butchery requires a </w:t>
+      </w:r>
+      <w:r>
+        <w:rPr>
+          <w:b/>
+          <w:bCs/>
+        </w:rPr>
+        <w:t>web-based order tracing application</w:t>
+      </w:r>
+      <w:r>
+        <w:t xml:space="preserve"> to manage customer orders from placement through to collection. The application must support real-time order tracking, staff authentication, and be usable across multiple device types.</w:t>
+      </w:r>
+    </w:p>
+    <w:p>
+      <w:r>
+        <w:pict w14:anchorId="20A17637">
+          <v:rect id="_x0000_i1067" style="width:0;height:1.5pt" o:hralign="center" o:hrstd="t" o:hr="t" fillcolor="#a0a0a0" stroked="f"/>
+        </w:pict>
+      </w:r>
+    </w:p>
+    <w:p>
+      <w:pPr>
+        <w:rPr>
+          <w:b/>
+          <w:bCs/>
+        </w:rPr>
+      </w:pPr>
+      <w:r>
+        <w:rPr>
+          <w:b/>
+          <w:bCs/>
+        </w:rPr>
+        <w:t>Application 1: Order Tracing App</w:t>
+      </w:r>
+    </w:p>
+    <w:p>
+      <w:pPr>
+        <w:rPr>
+          <w:b/>
+          <w:bCs/>
+        </w:rPr>
+      </w:pPr>
+      <w:r>
+        <w:rPr>
+          <w:b/>
+          <w:bCs/>
+        </w:rPr>
+        <w:t>1. Front-End Functional Requirements</w:t>
+      </w:r>
+    </w:p>
+    <w:p>
+      <w:pPr>
+        <w:rPr>
+          <w:b/>
+          <w:bCs/>
+        </w:rPr>
+      </w:pPr>
+      <w:r>
+        <w:rPr>
+          <w:b/>
+          <w:bCs/>
+        </w:rPr>
+        <w:t>1.1 Order Capture</w:t>
+      </w:r>
+    </w:p>
+    <w:p>
+      <w:r>
+        <w:t>The application must allow users to capture the following order details:</w:t>
+      </w:r>
+    </w:p>
+    <w:p>
+      <w:pPr>
+        <w:numPr>
+          <w:ilvl w:val="0"/>
+          <w:numId w:val="2"/>
+        </w:numPr>
+      </w:pPr>
+      <w:r>
+        <w:t>Order Number</w:t>
+      </w:r>
+    </w:p>
+    <w:p>
+      <w:pPr>
+        <w:numPr>
+          <w:ilvl w:val="0"/>
+          <w:numId w:val="2"/>
+        </w:numPr>
+      </w:pPr>
+      <w:r>
+        <w:t>Total Order Amount (ZAR)</w:t>
+      </w:r>
+    </w:p>
+    <w:p>
+      <w:pPr>
+        <w:numPr>
+          <w:ilvl w:val="0"/>
+          <w:numId w:val="2"/>
+        </w:numPr>
+      </w:pPr>
+      <w:r>
+        <w:t xml:space="preserve">Customer </w:t>
+      </w:r>
+      <w:proofErr w:type="spellStart"/>
+      <w:r>
+        <w:t>Cellphone</w:t>
+      </w:r>
+      <w:proofErr w:type="spellEnd"/>
+      <w:r>
+        <w:t xml:space="preserve"> Number</w:t>
+      </w:r>
+    </w:p>
+    <w:p>
+      <w:r>
+        <w:pict w14:anchorId="6D40DD9D">
+          <v:rect id="_x0000_i1068" style="width:0;height:1.5pt" o:hralign="center" o:hrstd="t" o:hr="t" fillcolor="#a0a0a0" stroked="f"/>
+        </w:pict>
+      </w:r>
+    </w:p>
+    <w:p>
+      <w:pPr>
+        <w:rPr>
+          <w:b/>
+          <w:bCs/>
+        </w:rPr>
+      </w:pPr>
+      <w:r>
+        <w:rPr>
+          <w:b/>
+          <w:bCs/>
+        </w:rPr>
+        <w:lastRenderedPageBreak/>
+        <w:t>1.2 Order Workflow (Stage-Based System)</w:t>
+      </w:r>
+    </w:p>
+    <w:p>
+      <w:r>
+        <w:t xml:space="preserve">The app must function similarly to </w:t>
+      </w:r>
+      <w:r>
+        <w:rPr>
+          <w:b/>
+          <w:bCs/>
+        </w:rPr>
+        <w:t>Notion-style boards</w:t>
+      </w:r>
+      <w:r>
+        <w:t>, allowing orders to move visually from one stage to another.</w:t>
+      </w:r>
+    </w:p>
+    <w:p>
+      <w:r>
+        <w:rPr>
+          <w:b/>
+          <w:bCs/>
+        </w:rPr>
+        <w:t>Order Stages:</w:t>
+      </w:r>
+    </w:p>
+    <w:p>
+      <w:pPr>
+        <w:numPr>
+          <w:ilvl w:val="0"/>
+          <w:numId w:val="3"/>
+        </w:numPr>
+      </w:pPr>
+      <w:r>
+        <w:rPr>
+          <w:b/>
+          <w:bCs/>
+        </w:rPr>
+        <w:t>Stage 1: Queue</w:t>
+      </w:r>
+    </w:p>
+    <w:p>
+      <w:pPr>
+        <w:numPr>
+          <w:ilvl w:val="1"/>
+          <w:numId w:val="3"/>
+        </w:numPr>
+      </w:pPr>
+      <w:r>
+        <w:t>Order has been received but not yet placed on the grill.</w:t>
+      </w:r>
+    </w:p>
+    <w:p>
+      <w:pPr>
+        <w:numPr>
+          <w:ilvl w:val="0"/>
+          <w:numId w:val="3"/>
+        </w:numPr>
+      </w:pPr>
+      <w:r>
+        <w:rPr>
+          <w:b/>
+          <w:bCs/>
+        </w:rPr>
+        <w:t>Stage 2: Grill</w:t>
+      </w:r>
+    </w:p>
+    <w:p>
+      <w:pPr>
+        <w:numPr>
+          <w:ilvl w:val="1"/>
+          <w:numId w:val="3"/>
+        </w:numPr>
+      </w:pPr>
+      <w:r>
+        <w:t>Order is currently being grilled.</w:t>
+      </w:r>
+    </w:p>
+    <w:p>
+      <w:pPr>
+        <w:numPr>
+          <w:ilvl w:val="1"/>
+          <w:numId w:val="3"/>
+        </w:numPr>
+      </w:pPr>
+      <w:r>
+        <w:t xml:space="preserve">An </w:t>
+      </w:r>
+      <w:r>
+        <w:rPr>
+          <w:b/>
+          <w:bCs/>
+        </w:rPr>
+        <w:t>estimated preparation timer</w:t>
+      </w:r>
+      <w:r>
+        <w:t xml:space="preserve"> must be displayed.</w:t>
+      </w:r>
+    </w:p>
+    <w:p>
+      <w:pPr>
+        <w:numPr>
+          <w:ilvl w:val="0"/>
+          <w:numId w:val="3"/>
+        </w:numPr>
+      </w:pPr>
+      <w:r>
+        <w:rPr>
+          <w:b/>
+          <w:bCs/>
+        </w:rPr>
+        <w:t>Stage 3: Ready</w:t>
+      </w:r>
+    </w:p>
+    <w:p>
+      <w:pPr>
+        <w:numPr>
+          <w:ilvl w:val="1"/>
+          <w:numId w:val="3"/>
+        </w:numPr>
+      </w:pPr>
+      <w:r>
+        <w:t>Order is ready for customer collection.</w:t>
+      </w:r>
+    </w:p>
+    <w:p>
+      <w:pPr>
+        <w:numPr>
+          <w:ilvl w:val="0"/>
+          <w:numId w:val="3"/>
+        </w:numPr>
+      </w:pPr>
+      <w:r>
+        <w:rPr>
+          <w:b/>
+          <w:bCs/>
+        </w:rPr>
+        <w:t>Stage 4: Collected</w:t>
+      </w:r>
+    </w:p>
+    <w:p>
+      <w:pPr>
+        <w:numPr>
+          <w:ilvl w:val="1"/>
+          <w:numId w:val="3"/>
+        </w:numPr>
+      </w:pPr>
+      <w:r>
+        <w:t>Order has been collected by the customer.</w:t>
+      </w:r>
+    </w:p>
+    <w:p>
+      <w:pPr>
+        <w:numPr>
+          <w:ilvl w:val="1"/>
+          <w:numId w:val="3"/>
+        </w:numPr>
+      </w:pPr>
+      <w:r>
+        <w:t xml:space="preserve">Collected orders must remain visible for </w:t>
+      </w:r>
+      <w:r>
+        <w:rPr>
+          <w:b/>
+          <w:bCs/>
+        </w:rPr>
+        <w:t>5 minutes</w:t>
+      </w:r>
+      <w:r>
+        <w:t>, after which they are removed from the interface to make space for new orders.</w:t>
+      </w:r>
+    </w:p>
+    <w:p>
+      <w:pPr>
+        <w:numPr>
+          <w:ilvl w:val="1"/>
+          <w:numId w:val="3"/>
+        </w:numPr>
+      </w:pPr>
+      <w:r>
+        <w:t xml:space="preserve">These orders must </w:t>
+      </w:r>
+      <w:r>
+        <w:rPr>
+          <w:b/>
+          <w:bCs/>
+        </w:rPr>
+        <w:t>remain searchable in the database</w:t>
+      </w:r>
+      <w:r>
+        <w:t xml:space="preserve"> after removal from the UI.</w:t>
+      </w:r>
+    </w:p>
+    <w:p>
+      <w:r>
+        <w:pict w14:anchorId="6C82D4BB">
+          <v:rect id="_x0000_i1069" style="width:0;height:1.5pt" o:hralign="center" o:hrstd="t" o:hr="t" fillcolor="#a0a0a0" stroked="f"/>
+        </w:pict>
+      </w:r>
+    </w:p>
+    <w:p>
+      <w:pPr>
+        <w:rPr>
+          <w:b/>
+          <w:bCs/>
+        </w:rPr>
+      </w:pPr>
+      <w:r>
+        <w:rPr>
+          <w:b/>
+          <w:bCs/>
+        </w:rPr>
+        <w:t>1.3 Order Cards</w:t>
+      </w:r>
+    </w:p>
+    <w:p>
+      <w:r>
+        <w:t xml:space="preserve">Each order must be displayed as a </w:t>
+      </w:r>
+      <w:r>
+        <w:rPr>
+          <w:b/>
+          <w:bCs/>
+        </w:rPr>
+        <w:t>card</w:t>
+      </w:r>
+      <w:r>
+        <w:t xml:space="preserve"> containing the following information:</w:t>
+      </w:r>
+    </w:p>
+    <w:p>
+      <w:pPr>
+        <w:numPr>
+          <w:ilvl w:val="0"/>
+          <w:numId w:val="4"/>
+        </w:numPr>
+      </w:pPr>
+      <w:r>
+        <w:t>Date</w:t>
+      </w:r>
+    </w:p>
+    <w:p>
+      <w:pPr>
+        <w:numPr>
+          <w:ilvl w:val="0"/>
+          <w:numId w:val="4"/>
+        </w:numPr>
+      </w:pPr>
+      <w:r>
+        <w:t>Order Number</w:t>
+      </w:r>
+    </w:p>
+    <w:p>
+      <w:pPr>
+        <w:numPr>
+          <w:ilvl w:val="0"/>
+          <w:numId w:val="4"/>
+        </w:numPr>
+      </w:pPr>
+      <w:r>
+        <w:t>Current Stage</w:t>
+      </w:r>
+    </w:p>
+    <w:p>
+      <w:pPr>
+        <w:numPr>
+          <w:ilvl w:val="0"/>
+          <w:numId w:val="4"/>
+        </w:numPr>
+      </w:pPr>
+      <w:r>
+        <w:t>Total Order Amount (ZAR)</w:t>
+      </w:r>
+    </w:p>
+    <w:p>
+      <w:r>
+        <w:rPr>
+          <w:b/>
+          <w:bCs/>
+        </w:rPr>
+        <w:t>Card Interaction:</w:t>
+      </w:r>
+    </w:p>
+    <w:p>
+      <w:pPr>
+        <w:numPr>
+          <w:ilvl w:val="0"/>
+          <w:numId w:val="5"/>
+        </w:numPr>
+      </w:pPr>
+      <w:r>
+        <w:t>Cards must be movable:</w:t>
+      </w:r>
+    </w:p>
+    <w:p>
+      <w:pPr>
+        <w:numPr>
+          <w:ilvl w:val="1"/>
+          <w:numId w:val="5"/>
+        </w:numPr>
+      </w:pPr>
+      <w:r>
+        <w:t xml:space="preserve">By </w:t>
+      </w:r>
+      <w:r>
+        <w:rPr>
+          <w:b/>
+          <w:bCs/>
+        </w:rPr>
+        <w:t>finger</w:t>
+      </w:r>
+      <w:r>
+        <w:t xml:space="preserve"> on touch-enabled devices</w:t>
+      </w:r>
+    </w:p>
+    <w:p>
+      <w:pPr>
+        <w:numPr>
+          <w:ilvl w:val="1"/>
+          <w:numId w:val="5"/>
+        </w:numPr>
+      </w:pPr>
+      <w:r>
+        <w:t xml:space="preserve">By </w:t>
+      </w:r>
+      <w:r>
+        <w:rPr>
+          <w:b/>
+          <w:bCs/>
+        </w:rPr>
+        <w:t>mouse</w:t>
+      </w:r>
+      <w:r>
+        <w:t xml:space="preserve"> on non-touch devices</w:t>
+      </w:r>
+    </w:p>
+    <w:p>
+      <w:r>
+        <w:pict w14:anchorId="7227FE25">
+          <v:rect id="_x0000_i1070" style="width:0;height:1.5pt" o:hralign="center" o:hrstd="t" o:hr="t" fillcolor="#a0a0a0" stroked="f"/>
+        </w:pict>
+      </w:r>
+    </w:p>
+    <w:p>
+      <w:pPr>
+        <w:rPr>
+          <w:b/>
+          <w:bCs/>
+        </w:rPr>
+      </w:pPr>
+      <w:r>
+        <w:rPr>
+          <w:b/>
+          <w:bCs/>
+        </w:rPr>
+        <w:lastRenderedPageBreak/>
+        <w:t>1.4 Search Functionality</w:t>
+      </w:r>
+    </w:p>
+    <w:p>
+      <w:pPr>
+        <w:numPr>
+          <w:ilvl w:val="0"/>
+          <w:numId w:val="6"/>
+        </w:numPr>
+      </w:pPr>
+      <w:r>
+        <w:t xml:space="preserve">Users must be able to search using an </w:t>
+      </w:r>
+      <w:r>
+        <w:rPr>
+          <w:b/>
+          <w:bCs/>
+        </w:rPr>
+        <w:t>order number</w:t>
+      </w:r>
+      <w:r>
+        <w:t>.</w:t>
+      </w:r>
+    </w:p>
+    <w:p>
+      <w:pPr>
+        <w:numPr>
+          <w:ilvl w:val="0"/>
+          <w:numId w:val="6"/>
+        </w:numPr>
+      </w:pPr>
+      <w:r>
+        <w:t xml:space="preserve">The system must return a </w:t>
+      </w:r>
+      <w:r>
+        <w:rPr>
+          <w:b/>
+          <w:bCs/>
+        </w:rPr>
+        <w:t>modal/popup</w:t>
+      </w:r>
+      <w:r>
+        <w:t xml:space="preserve"> displaying full order details.</w:t>
+      </w:r>
+    </w:p>
+    <w:p>
+      <w:r>
+        <w:pict w14:anchorId="034DC728">
+          <v:rect id="_x0000_i1071" style="width:0;height:1.5pt" o:hralign="center" o:hrstd="t" o:hr="t" fillcolor="#a0a0a0" stroked="f"/>
+        </w:pict>
+      </w:r>
+    </w:p>
+    <w:p>
+      <w:pPr>
+        <w:rPr>
+          <w:b/>
+          <w:bCs/>
+        </w:rPr>
+      </w:pPr>
+      <w:r>
+        <w:rPr>
+          <w:b/>
+          <w:bCs/>
+        </w:rPr>
+        <w:t>1.5 User Authentication</w:t>
+      </w:r>
+    </w:p>
+    <w:p>
+      <w:pPr>
+        <w:numPr>
+          <w:ilvl w:val="0"/>
+          <w:numId w:val="7"/>
+        </w:numPr>
+      </w:pPr>
+      <w:r>
+        <w:t xml:space="preserve">The application must include </w:t>
+      </w:r>
+      <w:r>
+        <w:rPr>
+          <w:b/>
+          <w:bCs/>
+        </w:rPr>
+        <w:t>login functionality</w:t>
+      </w:r>
+      <w:r>
+        <w:t>.</w:t>
+      </w:r>
+    </w:p>
+    <w:p>
+      <w:pPr>
+        <w:numPr>
+          <w:ilvl w:val="0"/>
+          <w:numId w:val="7"/>
+        </w:numPr>
+      </w:pPr>
+      <w:r>
+        <w:t xml:space="preserve">The </w:t>
+      </w:r>
+      <w:r>
+        <w:rPr>
+          <w:b/>
+          <w:bCs/>
+        </w:rPr>
+        <w:t>name of the logged-in user</w:t>
+      </w:r>
+      <w:r>
+        <w:t xml:space="preserve"> must be displayed on the interface.</w:t>
+      </w:r>
+    </w:p>
+    <w:p>
+      <w:r>
+        <w:pict w14:anchorId="59DE0ACB">
+          <v:rect id="_x0000_i1072" style="width:0;height:1.5pt" o:hralign="center" o:hrstd="t" o:hr="t" fillcolor="#a0a0a0" stroked="f"/>
+        </w:pict>
+      </w:r>
+    </w:p>
+    <w:p>
+      <w:pPr>
+        <w:rPr>
+          <w:b/>
+          <w:bCs/>
+        </w:rPr>
+      </w:pPr>
+      <w:r>
+        <w:rPr>
+          <w:b/>
+          <w:bCs/>
+        </w:rPr>
+        <w:t>2. Device Compatibility &amp; Accessibility</w:t>
+      </w:r>
+    </w:p>
+    <w:p>
+      <w:pPr>
+        <w:numPr>
+          <w:ilvl w:val="0"/>
+          <w:numId w:val="8"/>
+        </w:numPr>
+      </w:pPr>
+      <w:r>
+        <w:t>The application must be fully usable on:</w:t>
+      </w:r>
+    </w:p>
+    <w:p>
+      <w:pPr>
+        <w:numPr>
+          <w:ilvl w:val="1"/>
+          <w:numId w:val="8"/>
+        </w:numPr>
+      </w:pPr>
+      <w:r>
+        <w:t>Desktop</w:t>
+      </w:r>
+    </w:p>
+    <w:p>
+      <w:pPr>
+        <w:numPr>
+          <w:ilvl w:val="1"/>
+          <w:numId w:val="8"/>
+        </w:numPr>
+      </w:pPr>
+      <w:r>
+        <w:t>Tablet</w:t>
+      </w:r>
+    </w:p>
+    <w:p>
+      <w:pPr>
+        <w:numPr>
+          <w:ilvl w:val="1"/>
+          <w:numId w:val="8"/>
+        </w:numPr>
+      </w:pPr>
+      <w:r>
+        <w:t>Mobile devices</w:t>
+      </w:r>
+    </w:p>
+    <w:p>
+      <w:r>
+        <w:pict w14:anchorId="3650EF9B">
+          <v:rect id="_x0000_i1073" style="width:0;height:1.5pt" o:hralign="center" o:hrstd="t" o:hr="t" fillcolor="#a0a0a0" stroked="f"/>
+        </w:pict>
+      </w:r>
+    </w:p>
+    <w:p>
+      <w:pPr>
+        <w:rPr>
+          <w:b/>
+          <w:bCs/>
+        </w:rPr>
+      </w:pPr>
+      <w:r>
+        <w:rPr>
+          <w:b/>
+          <w:bCs/>
+        </w:rPr>
+        <w:t>3. Installation &amp; Deployment</w:t>
+      </w:r>
+    </w:p>
+    <w:p>
+      <w:pPr>
+        <w:numPr>
+          <w:ilvl w:val="0"/>
+          <w:numId w:val="9"/>
+        </w:numPr>
+      </w:pPr>
+      <w:r>
+        <w:t xml:space="preserve">The application must support installation on devices (e.g. </w:t>
+      </w:r>
+      <w:r>
+        <w:rPr>
+          <w:b/>
+          <w:bCs/>
+        </w:rPr>
+        <w:t>Progressive Web App or similar</w:t>
+      </w:r>
+      <w:r>
+        <w:t>).</w:t>
+      </w:r>
+    </w:p>
+    <w:p>
+      <w:pPr>
+        <w:numPr>
+          <w:ilvl w:val="0"/>
+          <w:numId w:val="9"/>
+        </w:numPr>
+      </w:pPr>
+      <w:r>
+        <w:t xml:space="preserve">Installation files must allow the app to behave like a </w:t>
+      </w:r>
+      <w:r>
+        <w:rPr>
+          <w:b/>
+          <w:bCs/>
+        </w:rPr>
+        <w:t>native installed application</w:t>
+      </w:r>
+      <w:r>
+        <w:t xml:space="preserve"> on supported devices.</w:t>
+      </w:r>
+    </w:p>
+    <w:p/>
     <w:p>
       <w:r>
         <w:t>App #2:</w:t>
@@ -424,6 +1188,155 @@
 <file path=word/numbering.xml><?xml version="1.0" encoding="utf-8"?>
 <w:numbering xmlns:wpc="http://schemas.microsoft.com/office/word/2010/wordprocessingCanvas" xmlns:cx="http://schemas.microsoft.com/office/drawing/2014/chartex" xmlns:cx1="http://schemas.microsoft.com/office/drawing/2015/9/8/chartex" xmlns:cx2="http://schemas.microsoft.com/office/drawing/2015/10/21/chartex" xmlns:cx3="http://schemas.microsoft.com/office/drawing/2016/5/9/chartex" xmlns:cx4="http://schemas.microsoft.com/office/drawing/2016/5/10/chartex" xmlns:cx5="http://schemas.microsoft.com/office/drawing/2016/5/11/chartex" xmlns:cx6="http://schemas.microsoft.com/office/drawing/2016/5/12/chartex" xmlns:cx7="http://schemas.microsoft.com/office/drawing/2016/5/13/chartex" xmlns:cx8="http://schemas.microsoft.com/office/drawing/2016/5/14/chartex" xmlns:mc="http://schemas.openxmlformats.org/markup-compatibility/2006" xmlns:aink="http://schemas.microsoft.com/office/drawing/2016/ink" xmlns:am3d="http://schemas.microsoft.com/office/drawing/2017/model3d" xmlns:o="urn:schemas-microsoft-com:office:office" xmlns:oel="http://schemas.microsoft.com/office/2019/extlst" xmlns:r="http://schemas.openxmlformats.org/officeDocument/2006/relationships" xmlns:m="http://schemas.openxmlformats.org/officeDocument/2006/math" xmlns:v="urn:schemas-microsoft-com:vml" xmlns:wp14="http://schemas.microsoft.com/office/word/2010/wordprocessingDrawing" xmlns:wp="http://schemas.openxmlformats.org/drawingml/2006/wordprocessingDrawing" xmlns:w10="urn:schemas-microsoft-com:office:word" xmlns:w="http://schemas.openxmlformats.org/wordprocessingml/2006/main" xmlns:w14="http://schemas.microsoft.com/office/word/2010/wordml" xmlns:w15="http://schemas.microsoft.com/office/word/2012/wordml" xmlns:w16cex="http://schemas.microsoft.com/office/word/2018/wordml/cex" xmlns:w16cid="http://schemas.microsoft.com/office/word/2016/wordml/cid" xmlns:w16="http://schemas.microsoft.com/office/word/2018/wordml" xmlns:w16du="http://schemas.microsoft.com/office/word/2023/wordml/word16du" xmlns:w16sdtdh="http://schemas.microsoft.com/office/word/2020/wordml/sdtdatahash" xmlns:w16sdtfl="http://schemas.microsoft.com/office/word/2024/wordml/sdtformatlock" xmlns:w16se="http://schemas.microsoft.com/office/word/2015/wordml/symex" xmlns:wpg="http://schemas.microsoft.com/office/word/2010/wordprocessingGroup" xmlns:wpi="http://schemas.microsoft.com/office/word/2010/wordprocessingInk" xmlns:wne="http://schemas.microsoft.com/office/word/2006/wordml" xmlns:wps="http://schemas.microsoft.com/office/word/2010/wordprocessingShape" mc:Ignorable="w14 w15 w16se w16cid w16 w16cex w16sdtdh w16sdtfl w16du wp14">
   <w:abstractNum w:abstractNumId="0" w15:restartNumberingAfterBreak="0">
+    <w:nsid w:val="0A88232B"/>
+    <w:multiLevelType w:val="multilevel"/>
+    <w:tmpl w:val="D04A36DC"/>
+    <w:lvl w:ilvl="0">
+      <w:start w:val="1"/>
+      <w:numFmt w:val="bullet"/>
+      <w:lvlText w:val=""/>
+      <w:lvlJc w:val="left"/>
+      <w:pPr>
+        <w:tabs>
+          <w:tab w:val="num" w:pos="720"/>
+        </w:tabs>
+        <w:ind w:left="720" w:hanging="360"/>
+      </w:pPr>
+      <w:rPr>
+        <w:rFonts w:ascii="Symbol" w:hAnsi="Symbol" w:hint="default"/>
+        <w:sz w:val="20"/>
+      </w:rPr>
+    </w:lvl>
+    <w:lvl w:ilvl="1" w:tentative="1">
+      <w:start w:val="1"/>
+      <w:numFmt w:val="bullet"/>
+      <w:lvlText w:val="o"/>
+      <w:lvlJc w:val="left"/>
+      <w:pPr>
+        <w:tabs>
+          <w:tab w:val="num" w:pos="1440"/>
+        </w:tabs>
+        <w:ind w:left="1440" w:hanging="360"/>
+      </w:pPr>
+      <w:rPr>
+        <w:rFonts w:ascii="Courier New" w:hAnsi="Courier New" w:hint="default"/>
+        <w:sz w:val="20"/>
+      </w:rPr>
+    </w:lvl>
+    <w:lvl w:ilvl="2" w:tentative="1">
+      <w:start w:val="1"/>
+      <w:numFmt w:val="bullet"/>
+      <w:lvlText w:val=""/>
+      <w:lvlJc w:val="left"/>
+      <w:pPr>
+        <w:tabs>
+          <w:tab w:val="num" w:pos="2160"/>
+        </w:tabs>
+        <w:ind w:left="2160" w:hanging="360"/>
+      </w:pPr>
+      <w:rPr>
+        <w:rFonts w:ascii="Wingdings" w:hAnsi="Wingdings" w:hint="default"/>
+        <w:sz w:val="20"/>
+      </w:rPr>
+    </w:lvl>
+    <w:lvl w:ilvl="3" w:tentative="1">
+      <w:start w:val="1"/>
+      <w:numFmt w:val="bullet"/>
+      <w:lvlText w:val=""/>
+      <w:lvlJc w:val="left"/>
+      <w:pPr>
+        <w:tabs>
+          <w:tab w:val="num" w:pos="2880"/>
+        </w:tabs>
+        <w:ind w:left="2880" w:hanging="360"/>
+      </w:pPr>
+      <w:rPr>
+        <w:rFonts w:ascii="Wingdings" w:hAnsi="Wingdings" w:hint="default"/>
+        <w:sz w:val="20"/>
+      </w:rPr>
+    </w:lvl>
+    <w:lvl w:ilvl="4" w:tentative="1">
+      <w:start w:val="1"/>
+      <w:numFmt w:val="bullet"/>
+      <w:lvlText w:val=""/>
+      <w:lvlJc w:val="left"/>
+      <w:pPr>
+        <w:tabs>
+          <w:tab w:val="num" w:pos="3600"/>
+        </w:tabs>
+        <w:ind w:left="3600" w:hanging="360"/>
+      </w:pPr>
+      <w:rPr>
+        <w:rFonts w:ascii="Wingdings" w:hAnsi="Wingdings" w:hint="default"/>
+        <w:sz w:val="20"/>
+      </w:rPr>
+    </w:lvl>
+    <w:lvl w:ilvl="5" w:tentative="1">
+      <w:start w:val="1"/>
+      <w:numFmt w:val="bullet"/>
+      <w:lvlText w:val=""/>
+      <w:lvlJc w:val="left"/>
+      <w:pPr>
+        <w:tabs>
+          <w:tab w:val="num" w:pos="4320"/>
+        </w:tabs>
+        <w:ind w:left="4320" w:hanging="360"/>
+      </w:pPr>
+      <w:rPr>
+        <w:rFonts w:ascii="Wingdings" w:hAnsi="Wingdings" w:hint="default"/>
+        <w:sz w:val="20"/>
+      </w:rPr>
+    </w:lvl>
+    <w:lvl w:ilvl="6" w:tentative="1">
+      <w:start w:val="1"/>
+      <w:numFmt w:val="bullet"/>
+      <w:lvlText w:val=""/>
+      <w:lvlJc w:val="left"/>
+      <w:pPr>
+        <w:tabs>
+          <w:tab w:val="num" w:pos="5040"/>
+        </w:tabs>
+        <w:ind w:left="5040" w:hanging="360"/>
+      </w:pPr>
+      <w:rPr>
+        <w:rFonts w:ascii="Wingdings" w:hAnsi="Wingdings" w:hint="default"/>
+        <w:sz w:val="20"/>
+      </w:rPr>
+    </w:lvl>
+    <w:lvl w:ilvl="7" w:tentative="1">
+      <w:start w:val="1"/>
+      <w:numFmt w:val="bullet"/>
+      <w:lvlText w:val=""/>
+      <w:lvlJc w:val="left"/>
+      <w:pPr>
+        <w:tabs>
+          <w:tab w:val="num" w:pos="5760"/>
+        </w:tabs>
+        <w:ind w:left="5760" w:hanging="360"/>
+      </w:pPr>
+      <w:rPr>
+        <w:rFonts w:ascii="Wingdings" w:hAnsi="Wingdings" w:hint="default"/>
+        <w:sz w:val="20"/>
+      </w:rPr>
+    </w:lvl>
+    <w:lvl w:ilvl="8" w:tentative="1">
+      <w:start w:val="1"/>
+      <w:numFmt w:val="bullet"/>
+      <w:lvlText w:val=""/>
+      <w:lvlJc w:val="left"/>
+      <w:pPr>
+        <w:tabs>
+          <w:tab w:val="num" w:pos="6480"/>
+        </w:tabs>
+        <w:ind w:left="6480" w:hanging="360"/>
+      </w:pPr>
+      <w:rPr>
+        <w:rFonts w:ascii="Wingdings" w:hAnsi="Wingdings" w:hint="default"/>
+        <w:sz w:val="20"/>
+      </w:rPr>
+    </w:lvl>
+  </w:abstractNum>
+  <w:abstractNum w:abstractNumId="1" w15:restartNumberingAfterBreak="0">
     <w:nsid w:val="0CE14E43"/>
     <w:multiLevelType w:val="hybridMultilevel"/>
     <w:tmpl w:val="A942C77A"/>
@@ -536,8 +1449,1075 @@
       </w:rPr>
     </w:lvl>
   </w:abstractNum>
+  <w:abstractNum w:abstractNumId="2" w15:restartNumberingAfterBreak="0">
+    <w:nsid w:val="157E2B13"/>
+    <w:multiLevelType w:val="multilevel"/>
+    <w:tmpl w:val="63CC03D4"/>
+    <w:lvl w:ilvl="0">
+      <w:start w:val="1"/>
+      <w:numFmt w:val="bullet"/>
+      <w:lvlText w:val=""/>
+      <w:lvlJc w:val="left"/>
+      <w:pPr>
+        <w:tabs>
+          <w:tab w:val="num" w:pos="720"/>
+        </w:tabs>
+        <w:ind w:left="720" w:hanging="360"/>
+      </w:pPr>
+      <w:rPr>
+        <w:rFonts w:ascii="Symbol" w:hAnsi="Symbol" w:hint="default"/>
+        <w:sz w:val="20"/>
+      </w:rPr>
+    </w:lvl>
+    <w:lvl w:ilvl="1">
+      <w:start w:val="1"/>
+      <w:numFmt w:val="bullet"/>
+      <w:lvlText w:val="o"/>
+      <w:lvlJc w:val="left"/>
+      <w:pPr>
+        <w:tabs>
+          <w:tab w:val="num" w:pos="1440"/>
+        </w:tabs>
+        <w:ind w:left="1440" w:hanging="360"/>
+      </w:pPr>
+      <w:rPr>
+        <w:rFonts w:ascii="Courier New" w:hAnsi="Courier New" w:hint="default"/>
+        <w:sz w:val="20"/>
+      </w:rPr>
+    </w:lvl>
+    <w:lvl w:ilvl="2" w:tentative="1">
+      <w:start w:val="1"/>
+      <w:numFmt w:val="bullet"/>
+      <w:lvlText w:val=""/>
+      <w:lvlJc w:val="left"/>
+      <w:pPr>
+        <w:tabs>
+          <w:tab w:val="num" w:pos="2160"/>
+        </w:tabs>
+        <w:ind w:left="2160" w:hanging="360"/>
+      </w:pPr>
+      <w:rPr>
+        <w:rFonts w:ascii="Wingdings" w:hAnsi="Wingdings" w:hint="default"/>
+        <w:sz w:val="20"/>
+      </w:rPr>
+    </w:lvl>
+    <w:lvl w:ilvl="3" w:tentative="1">
+      <w:start w:val="1"/>
+      <w:numFmt w:val="bullet"/>
+      <w:lvlText w:val=""/>
+      <w:lvlJc w:val="left"/>
+      <w:pPr>
+        <w:tabs>
+          <w:tab w:val="num" w:pos="2880"/>
+        </w:tabs>
+        <w:ind w:left="2880" w:hanging="360"/>
+      </w:pPr>
+      <w:rPr>
+        <w:rFonts w:ascii="Wingdings" w:hAnsi="Wingdings" w:hint="default"/>
+        <w:sz w:val="20"/>
+      </w:rPr>
+    </w:lvl>
+    <w:lvl w:ilvl="4" w:tentative="1">
+      <w:start w:val="1"/>
+      <w:numFmt w:val="bullet"/>
+      <w:lvlText w:val=""/>
+      <w:lvlJc w:val="left"/>
+      <w:pPr>
+        <w:tabs>
+          <w:tab w:val="num" w:pos="3600"/>
+        </w:tabs>
+        <w:ind w:left="3600" w:hanging="360"/>
+      </w:pPr>
+      <w:rPr>
+        <w:rFonts w:ascii="Wingdings" w:hAnsi="Wingdings" w:hint="default"/>
+        <w:sz w:val="20"/>
+      </w:rPr>
+    </w:lvl>
+    <w:lvl w:ilvl="5" w:tentative="1">
+      <w:start w:val="1"/>
+      <w:numFmt w:val="bullet"/>
+      <w:lvlText w:val=""/>
+      <w:lvlJc w:val="left"/>
+      <w:pPr>
+        <w:tabs>
+          <w:tab w:val="num" w:pos="4320"/>
+        </w:tabs>
+        <w:ind w:left="4320" w:hanging="360"/>
+      </w:pPr>
+      <w:rPr>
+        <w:rFonts w:ascii="Wingdings" w:hAnsi="Wingdings" w:hint="default"/>
+        <w:sz w:val="20"/>
+      </w:rPr>
+    </w:lvl>
+    <w:lvl w:ilvl="6" w:tentative="1">
+      <w:start w:val="1"/>
+      <w:numFmt w:val="bullet"/>
+      <w:lvlText w:val=""/>
+      <w:lvlJc w:val="left"/>
+      <w:pPr>
+        <w:tabs>
+          <w:tab w:val="num" w:pos="5040"/>
+        </w:tabs>
+        <w:ind w:left="5040" w:hanging="360"/>
+      </w:pPr>
+      <w:rPr>
+        <w:rFonts w:ascii="Wingdings" w:hAnsi="Wingdings" w:hint="default"/>
+        <w:sz w:val="20"/>
+      </w:rPr>
+    </w:lvl>
+    <w:lvl w:ilvl="7" w:tentative="1">
+      <w:start w:val="1"/>
+      <w:numFmt w:val="bullet"/>
+      <w:lvlText w:val=""/>
+      <w:lvlJc w:val="left"/>
+      <w:pPr>
+        <w:tabs>
+          <w:tab w:val="num" w:pos="5760"/>
+        </w:tabs>
+        <w:ind w:left="5760" w:hanging="360"/>
+      </w:pPr>
+      <w:rPr>
+        <w:rFonts w:ascii="Wingdings" w:hAnsi="Wingdings" w:hint="default"/>
+        <w:sz w:val="20"/>
+      </w:rPr>
+    </w:lvl>
+    <w:lvl w:ilvl="8" w:tentative="1">
+      <w:start w:val="1"/>
+      <w:numFmt w:val="bullet"/>
+      <w:lvlText w:val=""/>
+      <w:lvlJc w:val="left"/>
+      <w:pPr>
+        <w:tabs>
+          <w:tab w:val="num" w:pos="6480"/>
+        </w:tabs>
+        <w:ind w:left="6480" w:hanging="360"/>
+      </w:pPr>
+      <w:rPr>
+        <w:rFonts w:ascii="Wingdings" w:hAnsi="Wingdings" w:hint="default"/>
+        <w:sz w:val="20"/>
+      </w:rPr>
+    </w:lvl>
+  </w:abstractNum>
+  <w:abstractNum w:abstractNumId="3" w15:restartNumberingAfterBreak="0">
+    <w:nsid w:val="23827E2D"/>
+    <w:multiLevelType w:val="multilevel"/>
+    <w:tmpl w:val="B13E12F8"/>
+    <w:lvl w:ilvl="0">
+      <w:start w:val="1"/>
+      <w:numFmt w:val="bullet"/>
+      <w:lvlText w:val=""/>
+      <w:lvlJc w:val="left"/>
+      <w:pPr>
+        <w:tabs>
+          <w:tab w:val="num" w:pos="720"/>
+        </w:tabs>
+        <w:ind w:left="720" w:hanging="360"/>
+      </w:pPr>
+      <w:rPr>
+        <w:rFonts w:ascii="Symbol" w:hAnsi="Symbol" w:hint="default"/>
+        <w:sz w:val="20"/>
+      </w:rPr>
+    </w:lvl>
+    <w:lvl w:ilvl="1">
+      <w:start w:val="1"/>
+      <w:numFmt w:val="bullet"/>
+      <w:lvlText w:val="o"/>
+      <w:lvlJc w:val="left"/>
+      <w:pPr>
+        <w:tabs>
+          <w:tab w:val="num" w:pos="1440"/>
+        </w:tabs>
+        <w:ind w:left="1440" w:hanging="360"/>
+      </w:pPr>
+      <w:rPr>
+        <w:rFonts w:ascii="Courier New" w:hAnsi="Courier New" w:hint="default"/>
+        <w:sz w:val="20"/>
+      </w:rPr>
+    </w:lvl>
+    <w:lvl w:ilvl="2" w:tentative="1">
+      <w:start w:val="1"/>
+      <w:numFmt w:val="bullet"/>
+      <w:lvlText w:val=""/>
+      <w:lvlJc w:val="left"/>
+      <w:pPr>
+        <w:tabs>
+          <w:tab w:val="num" w:pos="2160"/>
+        </w:tabs>
+        <w:ind w:left="2160" w:hanging="360"/>
+      </w:pPr>
+      <w:rPr>
+        <w:rFonts w:ascii="Wingdings" w:hAnsi="Wingdings" w:hint="default"/>
+        <w:sz w:val="20"/>
+      </w:rPr>
+    </w:lvl>
+    <w:lvl w:ilvl="3" w:tentative="1">
+      <w:start w:val="1"/>
+      <w:numFmt w:val="bullet"/>
+      <w:lvlText w:val=""/>
+      <w:lvlJc w:val="left"/>
+      <w:pPr>
+        <w:tabs>
+          <w:tab w:val="num" w:pos="2880"/>
+        </w:tabs>
+        <w:ind w:left="2880" w:hanging="360"/>
+      </w:pPr>
+      <w:rPr>
+        <w:rFonts w:ascii="Wingdings" w:hAnsi="Wingdings" w:hint="default"/>
+        <w:sz w:val="20"/>
+      </w:rPr>
+    </w:lvl>
+    <w:lvl w:ilvl="4" w:tentative="1">
+      <w:start w:val="1"/>
+      <w:numFmt w:val="bullet"/>
+      <w:lvlText w:val=""/>
+      <w:lvlJc w:val="left"/>
+      <w:pPr>
+        <w:tabs>
+          <w:tab w:val="num" w:pos="3600"/>
+        </w:tabs>
+        <w:ind w:left="3600" w:hanging="360"/>
+      </w:pPr>
+      <w:rPr>
+        <w:rFonts w:ascii="Wingdings" w:hAnsi="Wingdings" w:hint="default"/>
+        <w:sz w:val="20"/>
+      </w:rPr>
+    </w:lvl>
+    <w:lvl w:ilvl="5" w:tentative="1">
+      <w:start w:val="1"/>
+      <w:numFmt w:val="bullet"/>
+      <w:lvlText w:val=""/>
+      <w:lvlJc w:val="left"/>
+      <w:pPr>
+        <w:tabs>
+          <w:tab w:val="num" w:pos="4320"/>
+        </w:tabs>
+        <w:ind w:left="4320" w:hanging="360"/>
+      </w:pPr>
+      <w:rPr>
+        <w:rFonts w:ascii="Wingdings" w:hAnsi="Wingdings" w:hint="default"/>
+        <w:sz w:val="20"/>
+      </w:rPr>
+    </w:lvl>
+    <w:lvl w:ilvl="6" w:tentative="1">
+      <w:start w:val="1"/>
+      <w:numFmt w:val="bullet"/>
+      <w:lvlText w:val=""/>
+      <w:lvlJc w:val="left"/>
+      <w:pPr>
+        <w:tabs>
+          <w:tab w:val="num" w:pos="5040"/>
+        </w:tabs>
+        <w:ind w:left="5040" w:hanging="360"/>
+      </w:pPr>
+      <w:rPr>
+        <w:rFonts w:ascii="Wingdings" w:hAnsi="Wingdings" w:hint="default"/>
+        <w:sz w:val="20"/>
+      </w:rPr>
+    </w:lvl>
+    <w:lvl w:ilvl="7" w:tentative="1">
+      <w:start w:val="1"/>
+      <w:numFmt w:val="bullet"/>
+      <w:lvlText w:val=""/>
+      <w:lvlJc w:val="left"/>
+      <w:pPr>
+        <w:tabs>
+          <w:tab w:val="num" w:pos="5760"/>
+        </w:tabs>
+        <w:ind w:left="5760" w:hanging="360"/>
+      </w:pPr>
+      <w:rPr>
+        <w:rFonts w:ascii="Wingdings" w:hAnsi="Wingdings" w:hint="default"/>
+        <w:sz w:val="20"/>
+      </w:rPr>
+    </w:lvl>
+    <w:lvl w:ilvl="8" w:tentative="1">
+      <w:start w:val="1"/>
+      <w:numFmt w:val="bullet"/>
+      <w:lvlText w:val=""/>
+      <w:lvlJc w:val="left"/>
+      <w:pPr>
+        <w:tabs>
+          <w:tab w:val="num" w:pos="6480"/>
+        </w:tabs>
+        <w:ind w:left="6480" w:hanging="360"/>
+      </w:pPr>
+      <w:rPr>
+        <w:rFonts w:ascii="Wingdings" w:hAnsi="Wingdings" w:hint="default"/>
+        <w:sz w:val="20"/>
+      </w:rPr>
+    </w:lvl>
+  </w:abstractNum>
+  <w:abstractNum w:abstractNumId="4" w15:restartNumberingAfterBreak="0">
+    <w:nsid w:val="37B56A70"/>
+    <w:multiLevelType w:val="multilevel"/>
+    <w:tmpl w:val="4328CD94"/>
+    <w:lvl w:ilvl="0">
+      <w:start w:val="1"/>
+      <w:numFmt w:val="bullet"/>
+      <w:lvlText w:val=""/>
+      <w:lvlJc w:val="left"/>
+      <w:pPr>
+        <w:tabs>
+          <w:tab w:val="num" w:pos="720"/>
+        </w:tabs>
+        <w:ind w:left="720" w:hanging="360"/>
+      </w:pPr>
+      <w:rPr>
+        <w:rFonts w:ascii="Symbol" w:hAnsi="Symbol" w:hint="default"/>
+        <w:sz w:val="20"/>
+      </w:rPr>
+    </w:lvl>
+    <w:lvl w:ilvl="1" w:tentative="1">
+      <w:start w:val="1"/>
+      <w:numFmt w:val="bullet"/>
+      <w:lvlText w:val="o"/>
+      <w:lvlJc w:val="left"/>
+      <w:pPr>
+        <w:tabs>
+          <w:tab w:val="num" w:pos="1440"/>
+        </w:tabs>
+        <w:ind w:left="1440" w:hanging="360"/>
+      </w:pPr>
+      <w:rPr>
+        <w:rFonts w:ascii="Courier New" w:hAnsi="Courier New" w:hint="default"/>
+        <w:sz w:val="20"/>
+      </w:rPr>
+    </w:lvl>
+    <w:lvl w:ilvl="2" w:tentative="1">
+      <w:start w:val="1"/>
+      <w:numFmt w:val="bullet"/>
+      <w:lvlText w:val=""/>
+      <w:lvlJc w:val="left"/>
+      <w:pPr>
+        <w:tabs>
+          <w:tab w:val="num" w:pos="2160"/>
+        </w:tabs>
+        <w:ind w:left="2160" w:hanging="360"/>
+      </w:pPr>
+      <w:rPr>
+        <w:rFonts w:ascii="Wingdings" w:hAnsi="Wingdings" w:hint="default"/>
+        <w:sz w:val="20"/>
+      </w:rPr>
+    </w:lvl>
+    <w:lvl w:ilvl="3" w:tentative="1">
+      <w:start w:val="1"/>
+      <w:numFmt w:val="bullet"/>
+      <w:lvlText w:val=""/>
+      <w:lvlJc w:val="left"/>
+      <w:pPr>
+        <w:tabs>
+          <w:tab w:val="num" w:pos="2880"/>
+        </w:tabs>
+        <w:ind w:left="2880" w:hanging="360"/>
+      </w:pPr>
+      <w:rPr>
+        <w:rFonts w:ascii="Wingdings" w:hAnsi="Wingdings" w:hint="default"/>
+        <w:sz w:val="20"/>
+      </w:rPr>
+    </w:lvl>
+    <w:lvl w:ilvl="4" w:tentative="1">
+      <w:start w:val="1"/>
+      <w:numFmt w:val="bullet"/>
+      <w:lvlText w:val=""/>
+      <w:lvlJc w:val="left"/>
+      <w:pPr>
+        <w:tabs>
+          <w:tab w:val="num" w:pos="3600"/>
+        </w:tabs>
+        <w:ind w:left="3600" w:hanging="360"/>
+      </w:pPr>
+      <w:rPr>
+        <w:rFonts w:ascii="Wingdings" w:hAnsi="Wingdings" w:hint="default"/>
+        <w:sz w:val="20"/>
+      </w:rPr>
+    </w:lvl>
+    <w:lvl w:ilvl="5" w:tentative="1">
+      <w:start w:val="1"/>
+      <w:numFmt w:val="bullet"/>
+      <w:lvlText w:val=""/>
+      <w:lvlJc w:val="left"/>
+      <w:pPr>
+        <w:tabs>
+          <w:tab w:val="num" w:pos="4320"/>
+        </w:tabs>
+        <w:ind w:left="4320" w:hanging="360"/>
+      </w:pPr>
+      <w:rPr>
+        <w:rFonts w:ascii="Wingdings" w:hAnsi="Wingdings" w:hint="default"/>
+        <w:sz w:val="20"/>
+      </w:rPr>
+    </w:lvl>
+    <w:lvl w:ilvl="6" w:tentative="1">
+      <w:start w:val="1"/>
+      <w:numFmt w:val="bullet"/>
+      <w:lvlText w:val=""/>
+      <w:lvlJc w:val="left"/>
+      <w:pPr>
+        <w:tabs>
+          <w:tab w:val="num" w:pos="5040"/>
+        </w:tabs>
+        <w:ind w:left="5040" w:hanging="360"/>
+      </w:pPr>
+      <w:rPr>
+        <w:rFonts w:ascii="Wingdings" w:hAnsi="Wingdings" w:hint="default"/>
+        <w:sz w:val="20"/>
+      </w:rPr>
+    </w:lvl>
+    <w:lvl w:ilvl="7" w:tentative="1">
+      <w:start w:val="1"/>
+      <w:numFmt w:val="bullet"/>
+      <w:lvlText w:val=""/>
+      <w:lvlJc w:val="left"/>
+      <w:pPr>
+        <w:tabs>
+          <w:tab w:val="num" w:pos="5760"/>
+        </w:tabs>
+        <w:ind w:left="5760" w:hanging="360"/>
+      </w:pPr>
+      <w:rPr>
+        <w:rFonts w:ascii="Wingdings" w:hAnsi="Wingdings" w:hint="default"/>
+        <w:sz w:val="20"/>
+      </w:rPr>
+    </w:lvl>
+    <w:lvl w:ilvl="8" w:tentative="1">
+      <w:start w:val="1"/>
+      <w:numFmt w:val="bullet"/>
+      <w:lvlText w:val=""/>
+      <w:lvlJc w:val="left"/>
+      <w:pPr>
+        <w:tabs>
+          <w:tab w:val="num" w:pos="6480"/>
+        </w:tabs>
+        <w:ind w:left="6480" w:hanging="360"/>
+      </w:pPr>
+      <w:rPr>
+        <w:rFonts w:ascii="Wingdings" w:hAnsi="Wingdings" w:hint="default"/>
+        <w:sz w:val="20"/>
+      </w:rPr>
+    </w:lvl>
+  </w:abstractNum>
+  <w:abstractNum w:abstractNumId="5" w15:restartNumberingAfterBreak="0">
+    <w:nsid w:val="37F85820"/>
+    <w:multiLevelType w:val="multilevel"/>
+    <w:tmpl w:val="19564414"/>
+    <w:lvl w:ilvl="0">
+      <w:start w:val="1"/>
+      <w:numFmt w:val="bullet"/>
+      <w:lvlText w:val=""/>
+      <w:lvlJc w:val="left"/>
+      <w:pPr>
+        <w:tabs>
+          <w:tab w:val="num" w:pos="720"/>
+        </w:tabs>
+        <w:ind w:left="720" w:hanging="360"/>
+      </w:pPr>
+      <w:rPr>
+        <w:rFonts w:ascii="Symbol" w:hAnsi="Symbol" w:hint="default"/>
+        <w:sz w:val="20"/>
+      </w:rPr>
+    </w:lvl>
+    <w:lvl w:ilvl="1" w:tentative="1">
+      <w:start w:val="1"/>
+      <w:numFmt w:val="bullet"/>
+      <w:lvlText w:val="o"/>
+      <w:lvlJc w:val="left"/>
+      <w:pPr>
+        <w:tabs>
+          <w:tab w:val="num" w:pos="1440"/>
+        </w:tabs>
+        <w:ind w:left="1440" w:hanging="360"/>
+      </w:pPr>
+      <w:rPr>
+        <w:rFonts w:ascii="Courier New" w:hAnsi="Courier New" w:hint="default"/>
+        <w:sz w:val="20"/>
+      </w:rPr>
+    </w:lvl>
+    <w:lvl w:ilvl="2" w:tentative="1">
+      <w:start w:val="1"/>
+      <w:numFmt w:val="bullet"/>
+      <w:lvlText w:val=""/>
+      <w:lvlJc w:val="left"/>
+      <w:pPr>
+        <w:tabs>
+          <w:tab w:val="num" w:pos="2160"/>
+        </w:tabs>
+        <w:ind w:left="2160" w:hanging="360"/>
+      </w:pPr>
+      <w:rPr>
+        <w:rFonts w:ascii="Wingdings" w:hAnsi="Wingdings" w:hint="default"/>
+        <w:sz w:val="20"/>
+      </w:rPr>
+    </w:lvl>
+    <w:lvl w:ilvl="3" w:tentative="1">
+      <w:start w:val="1"/>
+      <w:numFmt w:val="bullet"/>
+      <w:lvlText w:val=""/>
+      <w:lvlJc w:val="left"/>
+      <w:pPr>
+        <w:tabs>
+          <w:tab w:val="num" w:pos="2880"/>
+        </w:tabs>
+        <w:ind w:left="2880" w:hanging="360"/>
+      </w:pPr>
+      <w:rPr>
+        <w:rFonts w:ascii="Wingdings" w:hAnsi="Wingdings" w:hint="default"/>
+        <w:sz w:val="20"/>
+      </w:rPr>
+    </w:lvl>
+    <w:lvl w:ilvl="4" w:tentative="1">
+      <w:start w:val="1"/>
+      <w:numFmt w:val="bullet"/>
+      <w:lvlText w:val=""/>
+      <w:lvlJc w:val="left"/>
+      <w:pPr>
+        <w:tabs>
+          <w:tab w:val="num" w:pos="3600"/>
+        </w:tabs>
+        <w:ind w:left="3600" w:hanging="360"/>
+      </w:pPr>
+      <w:rPr>
+        <w:rFonts w:ascii="Wingdings" w:hAnsi="Wingdings" w:hint="default"/>
+        <w:sz w:val="20"/>
+      </w:rPr>
+    </w:lvl>
+    <w:lvl w:ilvl="5" w:tentative="1">
+      <w:start w:val="1"/>
+      <w:numFmt w:val="bullet"/>
+      <w:lvlText w:val=""/>
+      <w:lvlJc w:val="left"/>
+      <w:pPr>
+        <w:tabs>
+          <w:tab w:val="num" w:pos="4320"/>
+        </w:tabs>
+        <w:ind w:left="4320" w:hanging="360"/>
+      </w:pPr>
+      <w:rPr>
+        <w:rFonts w:ascii="Wingdings" w:hAnsi="Wingdings" w:hint="default"/>
+        <w:sz w:val="20"/>
+      </w:rPr>
+    </w:lvl>
+    <w:lvl w:ilvl="6" w:tentative="1">
+      <w:start w:val="1"/>
+      <w:numFmt w:val="bullet"/>
+      <w:lvlText w:val=""/>
+      <w:lvlJc w:val="left"/>
+      <w:pPr>
+        <w:tabs>
+          <w:tab w:val="num" w:pos="5040"/>
+        </w:tabs>
+        <w:ind w:left="5040" w:hanging="360"/>
+      </w:pPr>
+      <w:rPr>
+        <w:rFonts w:ascii="Wingdings" w:hAnsi="Wingdings" w:hint="default"/>
+        <w:sz w:val="20"/>
+      </w:rPr>
+    </w:lvl>
+    <w:lvl w:ilvl="7" w:tentative="1">
+      <w:start w:val="1"/>
+      <w:numFmt w:val="bullet"/>
+      <w:lvlText w:val=""/>
+      <w:lvlJc w:val="left"/>
+      <w:pPr>
+        <w:tabs>
+          <w:tab w:val="num" w:pos="5760"/>
+        </w:tabs>
+        <w:ind w:left="5760" w:hanging="360"/>
+      </w:pPr>
+      <w:rPr>
+        <w:rFonts w:ascii="Wingdings" w:hAnsi="Wingdings" w:hint="default"/>
+        <w:sz w:val="20"/>
+      </w:rPr>
+    </w:lvl>
+    <w:lvl w:ilvl="8" w:tentative="1">
+      <w:start w:val="1"/>
+      <w:numFmt w:val="bullet"/>
+      <w:lvlText w:val=""/>
+      <w:lvlJc w:val="left"/>
+      <w:pPr>
+        <w:tabs>
+          <w:tab w:val="num" w:pos="6480"/>
+        </w:tabs>
+        <w:ind w:left="6480" w:hanging="360"/>
+      </w:pPr>
+      <w:rPr>
+        <w:rFonts w:ascii="Wingdings" w:hAnsi="Wingdings" w:hint="default"/>
+        <w:sz w:val="20"/>
+      </w:rPr>
+    </w:lvl>
+  </w:abstractNum>
+  <w:abstractNum w:abstractNumId="6" w15:restartNumberingAfterBreak="0">
+    <w:nsid w:val="40681F43"/>
+    <w:multiLevelType w:val="multilevel"/>
+    <w:tmpl w:val="F6F2472C"/>
+    <w:lvl w:ilvl="0">
+      <w:start w:val="1"/>
+      <w:numFmt w:val="bullet"/>
+      <w:lvlText w:val=""/>
+      <w:lvlJc w:val="left"/>
+      <w:pPr>
+        <w:tabs>
+          <w:tab w:val="num" w:pos="720"/>
+        </w:tabs>
+        <w:ind w:left="720" w:hanging="360"/>
+      </w:pPr>
+      <w:rPr>
+        <w:rFonts w:ascii="Symbol" w:hAnsi="Symbol" w:hint="default"/>
+        <w:sz w:val="20"/>
+      </w:rPr>
+    </w:lvl>
+    <w:lvl w:ilvl="1" w:tentative="1">
+      <w:start w:val="1"/>
+      <w:numFmt w:val="bullet"/>
+      <w:lvlText w:val="o"/>
+      <w:lvlJc w:val="left"/>
+      <w:pPr>
+        <w:tabs>
+          <w:tab w:val="num" w:pos="1440"/>
+        </w:tabs>
+        <w:ind w:left="1440" w:hanging="360"/>
+      </w:pPr>
+      <w:rPr>
+        <w:rFonts w:ascii="Courier New" w:hAnsi="Courier New" w:hint="default"/>
+        <w:sz w:val="20"/>
+      </w:rPr>
+    </w:lvl>
+    <w:lvl w:ilvl="2" w:tentative="1">
+      <w:start w:val="1"/>
+      <w:numFmt w:val="bullet"/>
+      <w:lvlText w:val=""/>
+      <w:lvlJc w:val="left"/>
+      <w:pPr>
+        <w:tabs>
+          <w:tab w:val="num" w:pos="2160"/>
+        </w:tabs>
+        <w:ind w:left="2160" w:hanging="360"/>
+      </w:pPr>
+      <w:rPr>
+        <w:rFonts w:ascii="Wingdings" w:hAnsi="Wingdings" w:hint="default"/>
+        <w:sz w:val="20"/>
+      </w:rPr>
+    </w:lvl>
+    <w:lvl w:ilvl="3" w:tentative="1">
+      <w:start w:val="1"/>
+      <w:numFmt w:val="bullet"/>
+      <w:lvlText w:val=""/>
+      <w:lvlJc w:val="left"/>
+      <w:pPr>
+        <w:tabs>
+          <w:tab w:val="num" w:pos="2880"/>
+        </w:tabs>
+        <w:ind w:left="2880" w:hanging="360"/>
+      </w:pPr>
+      <w:rPr>
+        <w:rFonts w:ascii="Wingdings" w:hAnsi="Wingdings" w:hint="default"/>
+        <w:sz w:val="20"/>
+      </w:rPr>
+    </w:lvl>
+    <w:lvl w:ilvl="4" w:tentative="1">
+      <w:start w:val="1"/>
+      <w:numFmt w:val="bullet"/>
+      <w:lvlText w:val=""/>
+      <w:lvlJc w:val="left"/>
+      <w:pPr>
+        <w:tabs>
+          <w:tab w:val="num" w:pos="3600"/>
+        </w:tabs>
+        <w:ind w:left="3600" w:hanging="360"/>
+      </w:pPr>
+      <w:rPr>
+        <w:rFonts w:ascii="Wingdings" w:hAnsi="Wingdings" w:hint="default"/>
+        <w:sz w:val="20"/>
+      </w:rPr>
+    </w:lvl>
+    <w:lvl w:ilvl="5" w:tentative="1">
+      <w:start w:val="1"/>
+      <w:numFmt w:val="bullet"/>
+      <w:lvlText w:val=""/>
+      <w:lvlJc w:val="left"/>
+      <w:pPr>
+        <w:tabs>
+          <w:tab w:val="num" w:pos="4320"/>
+        </w:tabs>
+        <w:ind w:left="4320" w:hanging="360"/>
+      </w:pPr>
+      <w:rPr>
+        <w:rFonts w:ascii="Wingdings" w:hAnsi="Wingdings" w:hint="default"/>
+        <w:sz w:val="20"/>
+      </w:rPr>
+    </w:lvl>
+    <w:lvl w:ilvl="6" w:tentative="1">
+      <w:start w:val="1"/>
+      <w:numFmt w:val="bullet"/>
+      <w:lvlText w:val=""/>
+      <w:lvlJc w:val="left"/>
+      <w:pPr>
+        <w:tabs>
+          <w:tab w:val="num" w:pos="5040"/>
+        </w:tabs>
+        <w:ind w:left="5040" w:hanging="360"/>
+      </w:pPr>
+      <w:rPr>
+        <w:rFonts w:ascii="Wingdings" w:hAnsi="Wingdings" w:hint="default"/>
+        <w:sz w:val="20"/>
+      </w:rPr>
+    </w:lvl>
+    <w:lvl w:ilvl="7" w:tentative="1">
+      <w:start w:val="1"/>
+      <w:numFmt w:val="bullet"/>
+      <w:lvlText w:val=""/>
+      <w:lvlJc w:val="left"/>
+      <w:pPr>
+        <w:tabs>
+          <w:tab w:val="num" w:pos="5760"/>
+        </w:tabs>
+        <w:ind w:left="5760" w:hanging="360"/>
+      </w:pPr>
+      <w:rPr>
+        <w:rFonts w:ascii="Wingdings" w:hAnsi="Wingdings" w:hint="default"/>
+        <w:sz w:val="20"/>
+      </w:rPr>
+    </w:lvl>
+    <w:lvl w:ilvl="8" w:tentative="1">
+      <w:start w:val="1"/>
+      <w:numFmt w:val="bullet"/>
+      <w:lvlText w:val=""/>
+      <w:lvlJc w:val="left"/>
+      <w:pPr>
+        <w:tabs>
+          <w:tab w:val="num" w:pos="6480"/>
+        </w:tabs>
+        <w:ind w:left="6480" w:hanging="360"/>
+      </w:pPr>
+      <w:rPr>
+        <w:rFonts w:ascii="Wingdings" w:hAnsi="Wingdings" w:hint="default"/>
+        <w:sz w:val="20"/>
+      </w:rPr>
+    </w:lvl>
+  </w:abstractNum>
+  <w:abstractNum w:abstractNumId="7" w15:restartNumberingAfterBreak="0">
+    <w:nsid w:val="4E845297"/>
+    <w:multiLevelType w:val="multilevel"/>
+    <w:tmpl w:val="53B47170"/>
+    <w:lvl w:ilvl="0">
+      <w:start w:val="1"/>
+      <w:numFmt w:val="bullet"/>
+      <w:lvlText w:val=""/>
+      <w:lvlJc w:val="left"/>
+      <w:pPr>
+        <w:tabs>
+          <w:tab w:val="num" w:pos="720"/>
+        </w:tabs>
+        <w:ind w:left="720" w:hanging="360"/>
+      </w:pPr>
+      <w:rPr>
+        <w:rFonts w:ascii="Symbol" w:hAnsi="Symbol" w:hint="default"/>
+        <w:sz w:val="20"/>
+      </w:rPr>
+    </w:lvl>
+    <w:lvl w:ilvl="1" w:tentative="1">
+      <w:start w:val="1"/>
+      <w:numFmt w:val="bullet"/>
+      <w:lvlText w:val="o"/>
+      <w:lvlJc w:val="left"/>
+      <w:pPr>
+        <w:tabs>
+          <w:tab w:val="num" w:pos="1440"/>
+        </w:tabs>
+        <w:ind w:left="1440" w:hanging="360"/>
+      </w:pPr>
+      <w:rPr>
+        <w:rFonts w:ascii="Courier New" w:hAnsi="Courier New" w:hint="default"/>
+        <w:sz w:val="20"/>
+      </w:rPr>
+    </w:lvl>
+    <w:lvl w:ilvl="2" w:tentative="1">
+      <w:start w:val="1"/>
+      <w:numFmt w:val="bullet"/>
+      <w:lvlText w:val=""/>
+      <w:lvlJc w:val="left"/>
+      <w:pPr>
+        <w:tabs>
+          <w:tab w:val="num" w:pos="2160"/>
+        </w:tabs>
+        <w:ind w:left="2160" w:hanging="360"/>
+      </w:pPr>
+      <w:rPr>
+        <w:rFonts w:ascii="Wingdings" w:hAnsi="Wingdings" w:hint="default"/>
+        <w:sz w:val="20"/>
+      </w:rPr>
+    </w:lvl>
+    <w:lvl w:ilvl="3" w:tentative="1">
+      <w:start w:val="1"/>
+      <w:numFmt w:val="bullet"/>
+      <w:lvlText w:val=""/>
+      <w:lvlJc w:val="left"/>
+      <w:pPr>
+        <w:tabs>
+          <w:tab w:val="num" w:pos="2880"/>
+        </w:tabs>
+        <w:ind w:left="2880" w:hanging="360"/>
+      </w:pPr>
+      <w:rPr>
+        <w:rFonts w:ascii="Wingdings" w:hAnsi="Wingdings" w:hint="default"/>
+        <w:sz w:val="20"/>
+      </w:rPr>
+    </w:lvl>
+    <w:lvl w:ilvl="4" w:tentative="1">
+      <w:start w:val="1"/>
+      <w:numFmt w:val="bullet"/>
+      <w:lvlText w:val=""/>
+      <w:lvlJc w:val="left"/>
+      <w:pPr>
+        <w:tabs>
+          <w:tab w:val="num" w:pos="3600"/>
+        </w:tabs>
+        <w:ind w:left="3600" w:hanging="360"/>
+      </w:pPr>
+      <w:rPr>
+        <w:rFonts w:ascii="Wingdings" w:hAnsi="Wingdings" w:hint="default"/>
+        <w:sz w:val="20"/>
+      </w:rPr>
+    </w:lvl>
+    <w:lvl w:ilvl="5" w:tentative="1">
+      <w:start w:val="1"/>
+      <w:numFmt w:val="bullet"/>
+      <w:lvlText w:val=""/>
+      <w:lvlJc w:val="left"/>
+      <w:pPr>
+        <w:tabs>
+          <w:tab w:val="num" w:pos="4320"/>
+        </w:tabs>
+        <w:ind w:left="4320" w:hanging="360"/>
+      </w:pPr>
+      <w:rPr>
+        <w:rFonts w:ascii="Wingdings" w:hAnsi="Wingdings" w:hint="default"/>
+        <w:sz w:val="20"/>
+      </w:rPr>
+    </w:lvl>
+    <w:lvl w:ilvl="6" w:tentative="1">
+      <w:start w:val="1"/>
+      <w:numFmt w:val="bullet"/>
+      <w:lvlText w:val=""/>
+      <w:lvlJc w:val="left"/>
+      <w:pPr>
+        <w:tabs>
+          <w:tab w:val="num" w:pos="5040"/>
+        </w:tabs>
+        <w:ind w:left="5040" w:hanging="360"/>
+      </w:pPr>
+      <w:rPr>
+        <w:rFonts w:ascii="Wingdings" w:hAnsi="Wingdings" w:hint="default"/>
+        <w:sz w:val="20"/>
+      </w:rPr>
+    </w:lvl>
+    <w:lvl w:ilvl="7" w:tentative="1">
+      <w:start w:val="1"/>
+      <w:numFmt w:val="bullet"/>
+      <w:lvlText w:val=""/>
+      <w:lvlJc w:val="left"/>
+      <w:pPr>
+        <w:tabs>
+          <w:tab w:val="num" w:pos="5760"/>
+        </w:tabs>
+        <w:ind w:left="5760" w:hanging="360"/>
+      </w:pPr>
+      <w:rPr>
+        <w:rFonts w:ascii="Wingdings" w:hAnsi="Wingdings" w:hint="default"/>
+        <w:sz w:val="20"/>
+      </w:rPr>
+    </w:lvl>
+    <w:lvl w:ilvl="8" w:tentative="1">
+      <w:start w:val="1"/>
+      <w:numFmt w:val="bullet"/>
+      <w:lvlText w:val=""/>
+      <w:lvlJc w:val="left"/>
+      <w:pPr>
+        <w:tabs>
+          <w:tab w:val="num" w:pos="6480"/>
+        </w:tabs>
+        <w:ind w:left="6480" w:hanging="360"/>
+      </w:pPr>
+      <w:rPr>
+        <w:rFonts w:ascii="Wingdings" w:hAnsi="Wingdings" w:hint="default"/>
+        <w:sz w:val="20"/>
+      </w:rPr>
+    </w:lvl>
+  </w:abstractNum>
+  <w:abstractNum w:abstractNumId="8" w15:restartNumberingAfterBreak="0">
+    <w:nsid w:val="643C129E"/>
+    <w:multiLevelType w:val="multilevel"/>
+    <w:tmpl w:val="D9423E92"/>
+    <w:lvl w:ilvl="0">
+      <w:start w:val="1"/>
+      <w:numFmt w:val="bullet"/>
+      <w:lvlText w:val=""/>
+      <w:lvlJc w:val="left"/>
+      <w:pPr>
+        <w:tabs>
+          <w:tab w:val="num" w:pos="720"/>
+        </w:tabs>
+        <w:ind w:left="720" w:hanging="360"/>
+      </w:pPr>
+      <w:rPr>
+        <w:rFonts w:ascii="Symbol" w:hAnsi="Symbol" w:hint="default"/>
+        <w:sz w:val="20"/>
+      </w:rPr>
+    </w:lvl>
+    <w:lvl w:ilvl="1">
+      <w:start w:val="1"/>
+      <w:numFmt w:val="bullet"/>
+      <w:lvlText w:val="o"/>
+      <w:lvlJc w:val="left"/>
+      <w:pPr>
+        <w:tabs>
+          <w:tab w:val="num" w:pos="1440"/>
+        </w:tabs>
+        <w:ind w:left="1440" w:hanging="360"/>
+      </w:pPr>
+      <w:rPr>
+        <w:rFonts w:ascii="Courier New" w:hAnsi="Courier New" w:hint="default"/>
+        <w:sz w:val="20"/>
+      </w:rPr>
+    </w:lvl>
+    <w:lvl w:ilvl="2" w:tentative="1">
+      <w:start w:val="1"/>
+      <w:numFmt w:val="bullet"/>
+      <w:lvlText w:val=""/>
+      <w:lvlJc w:val="left"/>
+      <w:pPr>
+        <w:tabs>
+          <w:tab w:val="num" w:pos="2160"/>
+        </w:tabs>
+        <w:ind w:left="2160" w:hanging="360"/>
+      </w:pPr>
+      <w:rPr>
+        <w:rFonts w:ascii="Wingdings" w:hAnsi="Wingdings" w:hint="default"/>
+        <w:sz w:val="20"/>
+      </w:rPr>
+    </w:lvl>
+    <w:lvl w:ilvl="3" w:tentative="1">
+      <w:start w:val="1"/>
+      <w:numFmt w:val="bullet"/>
+      <w:lvlText w:val=""/>
+      <w:lvlJc w:val="left"/>
+      <w:pPr>
+        <w:tabs>
+          <w:tab w:val="num" w:pos="2880"/>
+        </w:tabs>
+        <w:ind w:left="2880" w:hanging="360"/>
+      </w:pPr>
+      <w:rPr>
+        <w:rFonts w:ascii="Wingdings" w:hAnsi="Wingdings" w:hint="default"/>
+        <w:sz w:val="20"/>
+      </w:rPr>
+    </w:lvl>
+    <w:lvl w:ilvl="4" w:tentative="1">
+      <w:start w:val="1"/>
+      <w:numFmt w:val="bullet"/>
+      <w:lvlText w:val=""/>
+      <w:lvlJc w:val="left"/>
+      <w:pPr>
+        <w:tabs>
+          <w:tab w:val="num" w:pos="3600"/>
+        </w:tabs>
+        <w:ind w:left="3600" w:hanging="360"/>
+      </w:pPr>
+      <w:rPr>
+        <w:rFonts w:ascii="Wingdings" w:hAnsi="Wingdings" w:hint="default"/>
+        <w:sz w:val="20"/>
+      </w:rPr>
+    </w:lvl>
+    <w:lvl w:ilvl="5" w:tentative="1">
+      <w:start w:val="1"/>
+      <w:numFmt w:val="bullet"/>
+      <w:lvlText w:val=""/>
+      <w:lvlJc w:val="left"/>
+      <w:pPr>
+        <w:tabs>
+          <w:tab w:val="num" w:pos="4320"/>
+        </w:tabs>
+        <w:ind w:left="4320" w:hanging="360"/>
+      </w:pPr>
+      <w:rPr>
+        <w:rFonts w:ascii="Wingdings" w:hAnsi="Wingdings" w:hint="default"/>
+        <w:sz w:val="20"/>
+      </w:rPr>
+    </w:lvl>
+    <w:lvl w:ilvl="6" w:tentative="1">
+      <w:start w:val="1"/>
+      <w:numFmt w:val="bullet"/>
+      <w:lvlText w:val=""/>
+      <w:lvlJc w:val="left"/>
+      <w:pPr>
+        <w:tabs>
+          <w:tab w:val="num" w:pos="5040"/>
+        </w:tabs>
+        <w:ind w:left="5040" w:hanging="360"/>
+      </w:pPr>
+      <w:rPr>
+        <w:rFonts w:ascii="Wingdings" w:hAnsi="Wingdings" w:hint="default"/>
+        <w:sz w:val="20"/>
+      </w:rPr>
+    </w:lvl>
+    <w:lvl w:ilvl="7" w:tentative="1">
+      <w:start w:val="1"/>
+      <w:numFmt w:val="bullet"/>
+      <w:lvlText w:val=""/>
+      <w:lvlJc w:val="left"/>
+      <w:pPr>
+        <w:tabs>
+          <w:tab w:val="num" w:pos="5760"/>
+        </w:tabs>
+        <w:ind w:left="5760" w:hanging="360"/>
+      </w:pPr>
+      <w:rPr>
+        <w:rFonts w:ascii="Wingdings" w:hAnsi="Wingdings" w:hint="default"/>
+        <w:sz w:val="20"/>
+      </w:rPr>
+    </w:lvl>
+    <w:lvl w:ilvl="8" w:tentative="1">
+      <w:start w:val="1"/>
+      <w:numFmt w:val="bullet"/>
+      <w:lvlText w:val=""/>
+      <w:lvlJc w:val="left"/>
+      <w:pPr>
+        <w:tabs>
+          <w:tab w:val="num" w:pos="6480"/>
+        </w:tabs>
+        <w:ind w:left="6480" w:hanging="360"/>
+      </w:pPr>
+      <w:rPr>
+        <w:rFonts w:ascii="Wingdings" w:hAnsi="Wingdings" w:hint="default"/>
+        <w:sz w:val="20"/>
+      </w:rPr>
+    </w:lvl>
+  </w:abstractNum>
   <w:num w:numId="1" w16cid:durableId="1131442223">
+    <w:abstractNumId w:val="1"/>
+  </w:num>
+  <w:num w:numId="2" w16cid:durableId="1686445698">
+    <w:abstractNumId w:val="6"/>
+  </w:num>
+  <w:num w:numId="3" w16cid:durableId="427042562">
+    <w:abstractNumId w:val="3"/>
+  </w:num>
+  <w:num w:numId="4" w16cid:durableId="498160879">
+    <w:abstractNumId w:val="4"/>
+  </w:num>
+  <w:num w:numId="5" w16cid:durableId="544105192">
+    <w:abstractNumId w:val="2"/>
+  </w:num>
+  <w:num w:numId="6" w16cid:durableId="456948824">
+    <w:abstractNumId w:val="5"/>
+  </w:num>
+  <w:num w:numId="7" w16cid:durableId="1935243304">
     <w:abstractNumId w:val="0"/>
+  </w:num>
+  <w:num w:numId="8" w16cid:durableId="2012490182">
+    <w:abstractNumId w:val="8"/>
+  </w:num>
+  <w:num w:numId="9" w16cid:durableId="837502891">
+    <w:abstractNumId w:val="7"/>
   </w:num>
 </w:numbering>
 </file>
@@ -1145,7 +3125,6 @@
   <w:style w:type="character" w:default="1" w:styleId="DefaultParagraphFont">
     <w:name w:val="Default Paragraph Font"/>
     <w:uiPriority w:val="1"/>
-    <w:semiHidden/>
     <w:unhideWhenUsed/>
   </w:style>
   <w:style w:type="table" w:default="1" w:styleId="TableNormal">

</xml_diff>